<commit_message>
feat: tambahkan 4 template bukti dukung Word & Excel untuk Indikator 01 Tata Kelola Pemerintah Digital
</commit_message>
<xml_diff>
--- a/public/templates/ind_01/Template_Peraturan_Arsitektur_dan_Peta_Rencana_Pemdi_Indikator01.docx
+++ b/public/templates/ind_01/Template_Peraturan_Arsitektur_dan_Peta_Rencana_Pemdi_Indikator01.docx
@@ -9,49 +9,27 @@
       <w:r>
         <w:rPr>
           <w:b/>
-          <w:sz w:val="24"/>
+          <w:sz w:val="26"/>
         </w:rPr>
-        <w:t>PEMERINTAH KABUPATEN / KOTA / PROVINSI [NAMA DAERAH]</w:t>
+        <w:t>BUPATI / WALIKOTA / GUBERNUR / KEPALA LEMBAGA [NAMA INSTANSI]</w:t>
+        <w:br/>
         <w:br/>
       </w:r>
       <w:r>
         <w:rPr>
           <w:b/>
-          <w:sz w:val="26"/>
+          <w:sz w:val="24"/>
         </w:rPr>
-        <w:t>TIM KOORDINASI PEMERINTAH DIGITAL / ASPEK 1: TATA KELOLA DAN MANAJEMEN</w:t>
+        <w:t>PERATURAN KEPALA DAERAH / KEPALA INSTANSI [NAMA INSTANSI]</w:t>
         <w:br/>
       </w:r>
       <w:r>
         <w:rPr>
-          <w:color w:val="646464"/>
-          <w:sz w:val="18"/>
+          <w:b/>
+          <w:sz w:val="24"/>
         </w:rPr>
-        <w:t>Jalan Praja Mandiri No. 01, Telp: (021) 7890123, Email: kominfo@daerah.go.id</w:t>
+        <w:t>NOMOR 08 TAHUN 2026</w:t>
         <w:br/>
-      </w:r>
-    </w:p>
-    <w:p>
-      <w:pPr>
-        <w:jc w:val="center"/>
-      </w:pPr>
-      <w:r>
-        <w:rPr>
-          <w:b/>
-        </w:rPr>
-        <w:t>=================================================================</w:t>
-      </w:r>
-    </w:p>
-    <w:p>
-      <w:pPr>
-        <w:jc w:val="center"/>
-      </w:pPr>
-      <w:r>
-        <w:rPr>
-          <w:b/>
-          <w:sz w:val="26"/>
-        </w:rPr>
-        <w:t>PERATURAN KEPALA DAERAH TENTANG ARSITEKTUR DAN PETA RENCANA PEMERINTAH DIGITAL TAHUN 2025-2029</w:t>
         <w:br/>
       </w:r>
       <w:r>
@@ -59,101 +37,20 @@
           <w:b/>
           <w:sz w:val="22"/>
         </w:rPr>
-        <w:t>Nomor: 24 Tahun 2025</w:t>
-        <w:br/>
+        <w:t>TENTANG</w:t>
         <w:br/>
       </w:r>
+      <w:r>
+        <w:rPr>
+          <w:b/>
+          <w:color w:val="1F4E79"/>
+          <w:sz w:val="26"/>
+        </w:rPr>
+        <w:t>ARSITEKTUR DAN PETA RENCANA PEMERINTAH DIGITAL</w:t>
+        <w:br/>
+        <w:t>TAHUN 2026-2030</w:t>
+      </w:r>
     </w:p>
-    <w:tbl>
-      <w:tblPr>
-        <w:tblW w:type="auto" w:w="0"/>
-        <w:jc w:val="center"/>
-        <w:tblLayout w:type="fixed"/>
-        <w:tblLook w:firstColumn="1" w:firstRow="1" w:lastColumn="0" w:lastRow="0" w:noHBand="0" w:noVBand="1" w:val="04A0"/>
-      </w:tblPr>
-      <w:tblGrid>
-        <w:gridCol w:w="4680"/>
-        <w:gridCol w:w="4680"/>
-      </w:tblGrid>
-      <w:tr>
-        <w:tc>
-          <w:tcPr>
-            <w:tcW w:type="dxa" w:w="4680"/>
-            <w:shd w:fill="F1F5F9"/>
-            <w:tcMar>
-              <w:top w:w="80" w:type="dxa"/>
-              <w:bottom w:w="80" w:type="dxa"/>
-              <w:left w:w="120" w:type="dxa"/>
-              <w:right w:w="120" w:type="dxa"/>
-            </w:tcMar>
-          </w:tcPr>
-          <w:p>
-            <w:r>
-              <w:rPr>
-                <w:b/>
-              </w:rPr>
-              <w:t>Kode Indikator Evaluasi</w:t>
-            </w:r>
-          </w:p>
-        </w:tc>
-        <w:tc>
-          <w:tcPr>
-            <w:tcW w:type="dxa" w:w="4680"/>
-            <w:shd w:fill="F1F5F9"/>
-            <w:tcMar>
-              <w:top w:w="80" w:type="dxa"/>
-              <w:bottom w:w="80" w:type="dxa"/>
-              <w:left w:w="120" w:type="dxa"/>
-              <w:right w:w="120" w:type="dxa"/>
-            </w:tcMar>
-          </w:tcPr>
-          <w:p>
-            <w:r>
-              <w:t>IND-01 - Tata Kelola Pemerintah Digital</w:t>
-            </w:r>
-          </w:p>
-        </w:tc>
-      </w:tr>
-      <w:tr>
-        <w:tc>
-          <w:tcPr>
-            <w:tcW w:type="dxa" w:w="4680"/>
-            <w:shd w:fill="F1F5F9"/>
-            <w:tcMar>
-              <w:top w:w="80" w:type="dxa"/>
-              <w:bottom w:w="80" w:type="dxa"/>
-              <w:left w:w="120" w:type="dxa"/>
-              <w:right w:w="120" w:type="dxa"/>
-            </w:tcMar>
-          </w:tcPr>
-          <w:p>
-            <w:r>
-              <w:rPr>
-                <w:b/>
-              </w:rPr>
-              <w:t>Aspek &amp; Regulasi Rujukan</w:t>
-            </w:r>
-          </w:p>
-        </w:tc>
-        <w:tc>
-          <w:tcPr>
-            <w:tcW w:type="dxa" w:w="4680"/>
-            <w:shd w:fill="F1F5F9"/>
-            <w:tcMar>
-              <w:top w:w="80" w:type="dxa"/>
-              <w:bottom w:w="80" w:type="dxa"/>
-              <w:left w:w="120" w:type="dxa"/>
-              <w:right w:w="120" w:type="dxa"/>
-            </w:tcMar>
-          </w:tcPr>
-          <w:p>
-            <w:r>
-              <w:t>Aspek 1: Tata Kelola dan Manajemen (PermenPANRB No. 8 Tahun 2026)</w:t>
-            </w:r>
-          </w:p>
-        </w:tc>
-      </w:tr>
-    </w:tbl>
     <w:p>
       <w:r>
         <w:br/>
@@ -163,84 +60,207 @@
       <w:r>
         <w:rPr>
           <w:b/>
-          <w:color w:val="1E3A8A"/>
-          <w:sz w:val="22"/>
         </w:rPr>
-        <w:t>BAB I KETENTUAN UMUM</w:t>
+        <w:t>MENIMBANG:</w:t>
+        <w:br/>
       </w:r>
-    </w:p>
-    <w:p>
-      <w:pPr>
-        <w:spacing w:line="276" w:lineRule="auto" w:after="120"/>
-      </w:pPr>
       <w:r>
-        <w:rPr>
-          <w:sz w:val="21"/>
-        </w:rPr>
-        <w:t>Menetapkan definisi Arsitektur SPBE, Domain Proses Bisnis, Domain Data, Domain Aplikasi, Domain Infrastruktur, Domain Keamanan, dan Domain Layanan sesuai Perpres 95/2018 dan PermenPANRB 8/2026.</w:t>
+        <w:t>a. bahwa untuk mewujudkan tata kelola pemerintahan yang bersih, efektif, transparan, dan akuntabel serta pelayanan publik yang berkualitas dan terpercaya, diperlukan keterpaduan penyelenggaraan pemerintahan berbasis digital;</w:t>
+        <w:br/>
+        <w:t>b. bahwa untuk memberikan arah keterpaduan dan penyelarasan proses bisnis, data, layanan, aplikasi, infrastruktur, dan keamanan SPBE, perlu disusun Arsitektur dan Peta Rencana Pemerintah Digital;</w:t>
+        <w:br/>
+        <w:t>c. bahwa untuk pemenuhan Indikator 1 Evaluasi Kinerja Pemerintahan Digital sesuai PermenPANRB Nomor 8 Tahun 2026 (Tingkat Kematangan Tata Kelola Pemerintah Digital), diperlukan penetapan regulasi formal Arsitektur dan Peta Rencana yang selaras dengan SIA-SPBE Nasional;</w:t>
+        <w:br/>
+        <w:t>d. bahwa berdasarkan pertimbangan sebagaimana dimaksud dalam huruf a, huruf b, dan huruf c, perlu menetapkan Peraturan Kepala Instansi tentang Arsitektur dan Peta Rencana Pemerintah Digital Tahun 2026-2030.</w:t>
       </w:r>
     </w:p>
     <w:p>
       <w:r>
         <w:rPr>
           <w:b/>
-          <w:color w:val="1E3A8A"/>
-          <w:sz w:val="22"/>
         </w:rPr>
-        <w:t>BAB II ARSITEKTUR PEMERINTAH DIGITAL</w:t>
+        <w:t>MENGINGAT:</w:t>
+        <w:br/>
+      </w:r>
+      <w:r>
+        <w:t>1. Undang-Undang Nomor 23 Tahun 2014 tentang Pemerintahan Daerah;</w:t>
+        <w:br/>
+        <w:t>2. Peraturan Presiden Nomor 95 Tahun 2018 tentang Sistem Pemerintahan Berbasis Elektronik (Lembaran Negara RI Tahun 2018 No. 182);</w:t>
+        <w:br/>
+        <w:t>3. Peraturan Presiden Nomor 39 Tahun 2019 tentang Satu Data Indonesia;</w:t>
+        <w:br/>
+        <w:t>4. Peraturan Presiden Nomor 132 Tahun 2022 tentang Arsitektur Sistem Pemerintahan Berbasis Elektronik Nasional;</w:t>
+        <w:br/>
+        <w:t>5. Peraturan Presiden Nomor 82 Tahun 2023 tentang Percepatan Transformasi Digital dan Keterpaduan Layanan Digital Nasional;</w:t>
+        <w:br/>
+        <w:t>6. Peraturan Menteri Pendayagunaan Aparatur Negara dan Reformasi Birokrasi Nomor 8 Tahun 2026 tentang Evaluasi Kinerja Pemerintahan Digital.</w:t>
       </w:r>
     </w:p>
     <w:p>
       <w:pPr>
-        <w:spacing w:line="276" w:lineRule="auto" w:after="120"/>
+        <w:pStyle w:val="Heading2"/>
+        <w:jc w:val="center"/>
       </w:pPr>
       <w:r>
         <w:rPr>
-          <w:sz w:val="21"/>
+          <w:color w:val="1F4E79"/>
         </w:rPr>
-        <w:t>Memuat struktur 6 domain arsitektur yang terpadu, referensi arsitektur nasional, dan keterpaduan lintas unit kerja instansi.</w:t>
+        <w:t>MEMUTUSKAN:</w:t>
       </w:r>
     </w:p>
     <w:p>
       <w:r>
         <w:rPr>
           <w:b/>
-          <w:color w:val="1E3A8A"/>
-          <w:sz w:val="22"/>
         </w:rPr>
-        <w:t>BAB III PETA RENCANA STRATEGIS</w:t>
+        <w:t xml:space="preserve">MENETAPKAN: </w:t>
+      </w:r>
+      <w:r>
+        <w:t>PERATURAN KEPALA DAERAH / INSTANSI TENTANG ARSITEKTUR DAN PETA RENCANA PEMERINTAH DIGITAL TAHUN 2026-2030.</w:t>
+        <w:br/>
+        <w:br/>
       </w:r>
     </w:p>
     <w:p>
       <w:pPr>
-        <w:spacing w:line="276" w:lineRule="auto" w:after="120"/>
+        <w:pStyle w:val="Heading3"/>
       </w:pPr>
       <w:r>
         <w:rPr>
-          <w:sz w:val="21"/>
+          <w:color w:val="2E75B6"/>
         </w:rPr>
-        <w:t>Tahapan inisiatif strategis 5 tahunan, alokasi program prioritas, estimasi kebutuhan anggaran, dan penanggung jawab per inisiatif.</w:t>
-      </w:r>
-    </w:p>
-    <w:p>
-      <w:r>
-        <w:rPr>
-          <w:b/>
-          <w:color w:val="1E3A8A"/>
-          <w:sz w:val="22"/>
-        </w:rPr>
-        <w:t>BAB IV INTEGRASI KE SIA-SPBE NASIONAL</w:t>
+        <w:t>Pasal 1 (Ketentuan Umum)</w:t>
       </w:r>
     </w:p>
     <w:p>
       <w:pPr>
-        <w:spacing w:line="276" w:lineRule="auto" w:after="120"/>
+        <w:ind w:left="288"/>
+      </w:pPr>
+      <w:r>
+        <w:t>Dalam Peraturan ini yang dimaksud dengan:</w:t>
+        <w:br/>
+        <w:t>1. Pemerintah Digital (SPBE) adalah penyelenggaraan pemerintahan yang memanfaatkan teknologi informasi dan komunikasi untuk memberikan layanan kepada instansi pemerintah, aparatur sipil negara, pelaku usaha, dan masyarakat.</w:t>
+        <w:br/>
+        <w:t>2. Arsitektur Pemerintah Digital adalah kerangka dasar yang mendeskripsikan integrasi proses bisnis, data dan informasi, infrastruktur, aplikasi, dan keamanan untuk menghasilkan layanan digital terpadu.</w:t>
+        <w:br/>
+        <w:t>3. Peta Rencana Pemerintah Digital adalah dokumen yang memuat rencana inisiatif strategis, peta jalan (roadmap), dan tahapan penerapan tata kelola digital selama 5 (lima) tahun.</w:t>
+        <w:br/>
+        <w:t>4. Sistem Informasi Arsitektur SPBE Nasional (SIA-SPBE) adalah platform digital nasional yang disediakan oleh Kementerian PANRB untuk mengintegrasikan dan menyelaraskan arsitektur seluruh instansi pemerintah.</w:t>
+      </w:r>
+    </w:p>
+    <w:p>
+      <w:pPr>
+        <w:pStyle w:val="Heading3"/>
       </w:pPr>
       <w:r>
         <w:rPr>
-          <w:sz w:val="21"/>
+          <w:color w:val="2E75B6"/>
         </w:rPr>
-        <w:t>Kewajiban seluruh unit kerja menginput dan melakukan pemutakhiran arsitektur ke Sistem Informasi Arsitektur SPBE Nasional (SIA-SPBE).</w:t>
+        <w:t>Pasal 2 (Kedudukan dan Ruang Lingkup)</w:t>
+      </w:r>
+    </w:p>
+    <w:p>
+      <w:pPr>
+        <w:ind w:left="288"/>
+      </w:pPr>
+      <w:r>
+        <w:t>1. Arsitektur dan Peta Rencana Pemerintah Digital berkedudukan sebagai pedoman wajib bagi seluruh Organisasi Perangkat Daerah (OPD) dan unit kerja dalam menyusun rencana strategis dan anggaran program digitalisasi.</w:t>
+        <w:br/>
+        <w:t>2. Arsitektur Pemerintah Digital mencakup 6 (enam) domain terpadu:</w:t>
+        <w:br/>
+        <w:t xml:space="preserve">   a. Domain Proses Bisnis;</w:t>
+        <w:br/>
+        <w:t xml:space="preserve">   b. Domain Data dan Informasi;</w:t>
+        <w:br/>
+        <w:t xml:space="preserve">   c. Domain Layanan Digital;</w:t>
+        <w:br/>
+        <w:t xml:space="preserve">   d. Domain Aplikasi;</w:t>
+        <w:br/>
+        <w:t xml:space="preserve">   e. Domain Infrastruktur; dan</w:t>
+        <w:br/>
+        <w:t xml:space="preserve">   f. Domain Keamanan Informasi.</w:t>
+      </w:r>
+    </w:p>
+    <w:p>
+      <w:pPr>
+        <w:pStyle w:val="Heading3"/>
+      </w:pPr>
+      <w:r>
+        <w:rPr>
+          <w:color w:val="2E75B6"/>
+        </w:rPr>
+        <w:t>Pasal 3 (Penyelarasan dengan Arsitektur Nasional)</w:t>
+      </w:r>
+    </w:p>
+    <w:p>
+      <w:pPr>
+        <w:ind w:left="288"/>
+      </w:pPr>
+      <w:r>
+        <w:t>1. Seluruh domain arsitektur sebagaimana dimaksud dalam Pasal 2 wajib dipetakan dan diselaraskan secara elektronik ke dalam Sistem Informasi Arsitektur (SIA-SPBE) Nasional Kementerian PANRB.</w:t>
+        <w:br/>
+        <w:t>2. Penyelarasan dilakukan dengan mengacu pada referensi arsitektur nasional yang berlaku dan tervalidasi secara berkala.</w:t>
+      </w:r>
+    </w:p>
+    <w:p>
+      <w:pPr>
+        <w:pStyle w:val="Heading3"/>
+      </w:pPr>
+      <w:r>
+        <w:rPr>
+          <w:color w:val="2E75B6"/>
+        </w:rPr>
+        <w:t>Pasal 4 (Peta Rencana 5 Tahunan)</w:t>
+      </w:r>
+    </w:p>
+    <w:p>
+      <w:pPr>
+        <w:ind w:left="288"/>
+      </w:pPr>
+      <w:r>
+        <w:t>1. Peta Rencana Pemerintah Digital memuat inisiatif strategis, alokasi program prioritas, tahapan implementasi tahunan (2026 s.d. 2030), dan estimasi kebutuhan pembiayaan.</w:t>
+        <w:br/>
+        <w:t>2. Program digitalisasi yang tertuang dalam Peta Rencana wajib diintegrasikan ke dalam Rencana Kerja Pemerintah Daerah (RKPD) dan Dokumen Pelaksanaan Anggaran (DPA) setiap tahun anggaran.</w:t>
+      </w:r>
+    </w:p>
+    <w:p>
+      <w:pPr>
+        <w:pStyle w:val="Heading3"/>
+      </w:pPr>
+      <w:r>
+        <w:rPr>
+          <w:color w:val="2E75B6"/>
+        </w:rPr>
+        <w:t>Pasal 5 (Evaluasi dan Pembaruan Berkala)</w:t>
+      </w:r>
+    </w:p>
+    <w:p>
+      <w:pPr>
+        <w:ind w:left="288"/>
+      </w:pPr>
+      <w:r>
+        <w:t>1. Tata kelola dan keterpaduan Arsitektur Pemerintah Digital wajib dievaluasi dan direviu secara berkala paling sedikit 1 (satu) kali dalam 2 (dua) tahun.</w:t>
+        <w:br/>
+        <w:t>2. Hasil evaluasi berkala dituangkan dalam Laporan Reviu Tata Kelola dan menjadi dasar perubahan atau adendum Peta Rencana Pemerintah Digital.</w:t>
+      </w:r>
+    </w:p>
+    <w:p>
+      <w:pPr>
+        <w:pStyle w:val="Heading3"/>
+      </w:pPr>
+      <w:r>
+        <w:rPr>
+          <w:color w:val="2E75B6"/>
+        </w:rPr>
+        <w:t>Pasal 6 (Ketentuan Penutup)</w:t>
+      </w:r>
+    </w:p>
+    <w:p>
+      <w:pPr>
+        <w:ind w:left="288"/>
+      </w:pPr>
+      <w:r>
+        <w:t>Peraturan ini mulai berlaku pada tanggal diundangkan. Agar setiap orang mengetahuinya, memerintahkan pengundangan Peraturan ini dengan penempatannya dalam Berita Daerah / Berita Resmi Instansi.</w:t>
       </w:r>
     </w:p>
     <w:p>
@@ -258,22 +278,15 @@
         </w:rPr>
         <w:t>Ditetapkan di: [Nama Kota]</w:t>
         <w:br/>
-        <w:t>Pada tanggal: 10 Maret 2026</w:t>
+        <w:t>Pada tanggal: 05 Januari 2026</w:t>
         <w:br/>
         <w:br/>
       </w:r>
-    </w:p>
-    <w:p>
-      <w:pPr>
-        <w:jc w:val="right"/>
-      </w:pPr>
       <w:r>
         <w:rPr>
           <w:b/>
-          <w:sz w:val="20"/>
         </w:rPr>
-        <w:t>KEPALA DINAS KOMUNIKASI DAN INFORMATIKA</w:t>
-        <w:br/>
+        <w:t>KEPALA DAERAH / PIMPINAN INSTANSI,</w:t>
         <w:br/>
         <w:br/>
         <w:br/>
@@ -282,17 +295,12 @@
       <w:r>
         <w:rPr>
           <w:b/>
-          <w:sz w:val="20"/>
         </w:rPr>
-        <w:t>[NAMA PEJABAT LENGKAP, GELAR]</w:t>
+        <w:t>[NAMA LENGKAP KEPALA DAERAH / INSTANSI]</w:t>
         <w:br/>
       </w:r>
       <w:r>
-        <w:rPr>
-          <w:sz w:val="18"/>
-        </w:rPr>
-        <w:t>NIP. 19800101 200501 1 001</w:t>
-        <w:br/>
+        <w:t>(Telah ditandatangani secara elektronik bersertifikat BSrE)</w:t>
       </w:r>
     </w:p>
     <w:sectPr>

</xml_diff>